<commit_message>
Refactor : pt probe
</commit_message>
<xml_diff>
--- a/multimeter/ProbeEquation.docx
+++ b/multimeter/ProbeEquation.docx
@@ -1,6 +1,6 @@
 
 <file path=word/document.xml><?xml version="1.0" encoding="utf-8"?>
-<w:document xmlns:wpc="http://schemas.microsoft.com/office/word/2010/wordprocessingCanvas" xmlns:cx="http://schemas.microsoft.com/office/drawing/2014/chartex" xmlns:cx1="http://schemas.microsoft.com/office/drawing/2015/9/8/chartex" xmlns:cx2="http://schemas.microsoft.com/office/drawing/2015/10/21/chartex" xmlns:cx3="http://schemas.microsoft.com/office/drawing/2016/5/9/chartex" xmlns:cx4="http://schemas.microsoft.com/office/drawing/2016/5/10/chartex" xmlns:cx5="http://schemas.microsoft.com/office/drawing/2016/5/11/chartex" xmlns:cx6="http://schemas.microsoft.com/office/drawing/2016/5/12/chartex" xmlns:cx7="http://schemas.microsoft.com/office/drawing/2016/5/13/chartex" xmlns:cx8="http://schemas.microsoft.com/office/drawing/2016/5/14/chartex" xmlns:mc="http://schemas.openxmlformats.org/markup-compatibility/2006" xmlns:aink="http://schemas.microsoft.com/office/drawing/2016/ink" xmlns:am3d="http://schemas.microsoft.com/office/drawing/2017/model3d" xmlns:o="urn:schemas-microsoft-com:office:office" xmlns:oel="http://schemas.microsoft.com/office/2019/extlst" xmlns:r="http://schemas.openxmlformats.org/officeDocument/2006/relationships" xmlns:m="http://schemas.openxmlformats.org/officeDocument/2006/math" xmlns:v="urn:schemas-microsoft-com:vml" xmlns:wp14="http://schemas.microsoft.com/office/word/2010/wordprocessingDrawing" xmlns:wp="http://schemas.openxmlformats.org/drawingml/2006/wordprocessingDrawing" xmlns:w10="urn:schemas-microsoft-com:office:word" xmlns:w="http://schemas.openxmlformats.org/wordprocessingml/2006/main" xmlns:w14="http://schemas.microsoft.com/office/word/2010/wordml" xmlns:w15="http://schemas.microsoft.com/office/word/2012/wordml" xmlns:w16cex="http://schemas.microsoft.com/office/word/2018/wordml/cex" xmlns:w16cid="http://schemas.microsoft.com/office/word/2016/wordml/cid" xmlns:w16="http://schemas.microsoft.com/office/word/2018/wordml" xmlns:w16sdtdh="http://schemas.microsoft.com/office/word/2020/wordml/sdtdatahash" xmlns:w16se="http://schemas.microsoft.com/office/word/2015/wordml/symex" xmlns:wpg="http://schemas.microsoft.com/office/word/2010/wordprocessingGroup" xmlns:wpi="http://schemas.microsoft.com/office/word/2010/wordprocessingInk" xmlns:wne="http://schemas.microsoft.com/office/word/2006/wordml" xmlns:wps="http://schemas.microsoft.com/office/word/2010/wordprocessingShape" mc:Ignorable="w14 w15 w16se w16cid w16 w16cex w16sdtdh wp14">
+<w:document xmlns:wpc="http://schemas.microsoft.com/office/word/2010/wordprocessingCanvas" xmlns:cx="http://schemas.microsoft.com/office/drawing/2014/chartex" xmlns:cx1="http://schemas.microsoft.com/office/drawing/2015/9/8/chartex" xmlns:cx2="http://schemas.microsoft.com/office/drawing/2015/10/21/chartex" xmlns:cx3="http://schemas.microsoft.com/office/drawing/2016/5/9/chartex" xmlns:cx4="http://schemas.microsoft.com/office/drawing/2016/5/10/chartex" xmlns:cx5="http://schemas.microsoft.com/office/drawing/2016/5/11/chartex" xmlns:cx6="http://schemas.microsoft.com/office/drawing/2016/5/12/chartex" xmlns:cx7="http://schemas.microsoft.com/office/drawing/2016/5/13/chartex" xmlns:cx8="http://schemas.microsoft.com/office/drawing/2016/5/14/chartex" xmlns:mc="http://schemas.openxmlformats.org/markup-compatibility/2006" xmlns:aink="http://schemas.microsoft.com/office/drawing/2016/ink" xmlns:am3d="http://schemas.microsoft.com/office/drawing/2017/model3d" xmlns:o="urn:schemas-microsoft-com:office:office" xmlns:r="http://schemas.openxmlformats.org/officeDocument/2006/relationships" xmlns:m="http://schemas.openxmlformats.org/officeDocument/2006/math" xmlns:v="urn:schemas-microsoft-com:vml" xmlns:wp14="http://schemas.microsoft.com/office/word/2010/wordprocessingDrawing" xmlns:wp="http://schemas.openxmlformats.org/drawingml/2006/wordprocessingDrawing" xmlns:w10="urn:schemas-microsoft-com:office:word" xmlns:w="http://schemas.openxmlformats.org/wordprocessingml/2006/main" xmlns:w14="http://schemas.microsoft.com/office/word/2010/wordml" xmlns:w15="http://schemas.microsoft.com/office/word/2012/wordml" xmlns:w16cex="http://schemas.microsoft.com/office/word/2018/wordml/cex" xmlns:w16cid="http://schemas.microsoft.com/office/word/2016/wordml/cid" xmlns:w16="http://schemas.microsoft.com/office/word/2018/wordml" xmlns:w16sdtdh="http://schemas.microsoft.com/office/word/2020/wordml/sdtdatahash" xmlns:w16se="http://schemas.microsoft.com/office/word/2015/wordml/symex" xmlns:wpg="http://schemas.microsoft.com/office/word/2010/wordprocessingGroup" xmlns:wpi="http://schemas.microsoft.com/office/word/2010/wordprocessingInk" xmlns:wne="http://schemas.microsoft.com/office/word/2006/wordml" xmlns:wps="http://schemas.microsoft.com/office/word/2010/wordprocessingShape" mc:Ignorable="w14 w15 w16se w16cid w16 w16cex w16sdtdh wp14">
   <w:body>
     <w:tbl>
       <w:tblPr>
@@ -17,8 +17,8 @@
         <w:tblLook w:val="04A0" w:firstRow="1" w:lastRow="0" w:firstColumn="1" w:lastColumn="0" w:noHBand="0" w:noVBand="1"/>
       </w:tblPr>
       <w:tblGrid>
-        <w:gridCol w:w="1476"/>
-        <w:gridCol w:w="4042"/>
+        <w:gridCol w:w="1656"/>
+        <w:gridCol w:w="4620"/>
       </w:tblGrid>
       <w:tr>
         <w:tc>
@@ -29,13 +29,17 @@
           <w:p>
             <w:pPr>
               <w:rPr>
-                <w:rFonts w:ascii="宋体" w:eastAsia="宋体" w:hAnsi="宋体"/>
+                <w:rFonts w:ascii="楷体" w:eastAsia="楷体" w:hAnsi="楷体"/>
+                <w:sz w:val="24"/>
+                <w:szCs w:val="28"/>
               </w:rPr>
             </w:pPr>
             <w:bookmarkStart w:id="0" w:name="_Hlk134528869"/>
             <w:r>
               <w:rPr>
-                <w:rFonts w:ascii="宋体" w:eastAsia="宋体" w:hAnsi="宋体" w:hint="eastAsia"/>
+                <w:rFonts w:ascii="楷体" w:eastAsia="楷体" w:hAnsi="楷体" w:hint="eastAsia"/>
+                <w:sz w:val="24"/>
+                <w:szCs w:val="28"/>
               </w:rPr>
               <w:t>电压探头</w:t>
             </w:r>
@@ -48,6 +52,10 @@
           <w:p>
             <w:pPr>
               <w:jc w:val="left"/>
+              <w:rPr>
+                <w:sz w:val="24"/>
+                <w:szCs w:val="28"/>
+              </w:rPr>
             </w:pPr>
             <m:oMathPara>
               <m:oMathParaPr>
@@ -57,6 +65,8 @@
                 <m:r>
                   <w:rPr>
                     <w:rFonts w:ascii="Cambria Math" w:hAnsi="Cambria Math"/>
+                    <w:sz w:val="24"/>
+                    <w:szCs w:val="28"/>
                   </w:rPr>
                   <m:t>E=</m:t>
                 </m:r>
@@ -67,6 +77,8 @@
                         <w:rFonts w:ascii="Cambria Math" w:hAnsi="Cambria Math"/>
                         <w:i/>
                         <w:color w:val="FF0000"/>
+                        <w:sz w:val="24"/>
+                        <w:szCs w:val="28"/>
                       </w:rPr>
                     </m:ctrlPr>
                   </m:sSubPr>
@@ -75,6 +87,8 @@
                       <w:rPr>
                         <w:rFonts w:ascii="Cambria Math" w:hAnsi="Cambria Math"/>
                         <w:color w:val="FF0000"/>
+                        <w:sz w:val="24"/>
+                        <w:szCs w:val="28"/>
                       </w:rPr>
                       <m:t>A</m:t>
                     </m:r>
@@ -84,6 +98,8 @@
                       <w:rPr>
                         <w:rFonts w:ascii="Cambria Math" w:hAnsi="Cambria Math"/>
                         <w:color w:val="FF0000"/>
+                        <w:sz w:val="24"/>
+                        <w:szCs w:val="28"/>
                       </w:rPr>
                       <m:t>0</m:t>
                     </m:r>
@@ -92,6 +108,8 @@
                 <m:r>
                   <w:rPr>
                     <w:rFonts w:ascii="Cambria Math" w:hAnsi="Cambria Math"/>
+                    <w:sz w:val="24"/>
+                    <w:szCs w:val="28"/>
                   </w:rPr>
                   <m:t>+</m:t>
                 </m:r>
@@ -102,6 +120,8 @@
                         <w:rFonts w:ascii="Cambria Math" w:hAnsi="Cambria Math"/>
                         <w:i/>
                         <w:color w:val="FF0000"/>
+                        <w:sz w:val="24"/>
+                        <w:szCs w:val="28"/>
                       </w:rPr>
                     </m:ctrlPr>
                   </m:sSubPr>
@@ -110,6 +130,8 @@
                       <w:rPr>
                         <w:rFonts w:ascii="Cambria Math" w:hAnsi="Cambria Math"/>
                         <w:color w:val="FF0000"/>
+                        <w:sz w:val="24"/>
+                        <w:szCs w:val="28"/>
                       </w:rPr>
                       <m:t>A</m:t>
                     </m:r>
@@ -119,6 +141,8 @@
                       <w:rPr>
                         <w:rFonts w:ascii="Cambria Math" w:hAnsi="Cambria Math"/>
                         <w:color w:val="FF0000"/>
+                        <w:sz w:val="24"/>
+                        <w:szCs w:val="28"/>
                       </w:rPr>
                       <m:t>1</m:t>
                     </m:r>
@@ -127,6 +151,8 @@
                 <m:r>
                   <w:rPr>
                     <w:rFonts w:ascii="Cambria Math" w:hAnsi="Cambria Math"/>
+                    <w:sz w:val="24"/>
+                    <w:szCs w:val="28"/>
                   </w:rPr>
                   <m:t>T+</m:t>
                 </m:r>
@@ -137,6 +163,8 @@
                         <w:rFonts w:ascii="Cambria Math" w:hAnsi="Cambria Math"/>
                         <w:i/>
                         <w:color w:val="FF0000"/>
+                        <w:sz w:val="24"/>
+                        <w:szCs w:val="28"/>
                       </w:rPr>
                     </m:ctrlPr>
                   </m:sSubPr>
@@ -145,6 +173,8 @@
                       <w:rPr>
                         <w:rFonts w:ascii="Cambria Math" w:hAnsi="Cambria Math"/>
                         <w:color w:val="FF0000"/>
+                        <w:sz w:val="24"/>
+                        <w:szCs w:val="28"/>
                       </w:rPr>
                       <m:t>A</m:t>
                     </m:r>
@@ -154,6 +184,8 @@
                       <w:rPr>
                         <w:rFonts w:ascii="Cambria Math" w:hAnsi="Cambria Math"/>
                         <w:color w:val="FF0000"/>
+                        <w:sz w:val="24"/>
+                        <w:szCs w:val="28"/>
                       </w:rPr>
                       <m:t>2</m:t>
                     </m:r>
@@ -165,6 +197,8 @@
                       <w:rPr>
                         <w:rFonts w:ascii="Cambria Math" w:hAnsi="Cambria Math"/>
                         <w:i/>
+                        <w:sz w:val="24"/>
+                        <w:szCs w:val="28"/>
                       </w:rPr>
                     </m:ctrlPr>
                   </m:sSupPr>
@@ -172,6 +206,8 @@
                     <m:r>
                       <w:rPr>
                         <w:rFonts w:ascii="Cambria Math" w:hAnsi="Cambria Math"/>
+                        <w:sz w:val="24"/>
+                        <w:szCs w:val="28"/>
                       </w:rPr>
                       <m:t>T</m:t>
                     </m:r>
@@ -180,6 +216,8 @@
                     <m:r>
                       <w:rPr>
                         <w:rFonts w:ascii="Cambria Math" w:hAnsi="Cambria Math"/>
+                        <w:sz w:val="24"/>
+                        <w:szCs w:val="28"/>
                       </w:rPr>
                       <m:t>2</m:t>
                     </m:r>
@@ -188,6 +226,8 @@
                 <m:r>
                   <w:rPr>
                     <w:rFonts w:ascii="Cambria Math" w:hAnsi="Cambria Math"/>
+                    <w:sz w:val="24"/>
+                    <w:szCs w:val="28"/>
                   </w:rPr>
                   <m:t>+</m:t>
                 </m:r>
@@ -198,6 +238,8 @@
                         <w:rFonts w:ascii="Cambria Math" w:hAnsi="Cambria Math"/>
                         <w:i/>
                         <w:color w:val="FF0000"/>
+                        <w:sz w:val="24"/>
+                        <w:szCs w:val="28"/>
                       </w:rPr>
                     </m:ctrlPr>
                   </m:sSubPr>
@@ -206,6 +248,8 @@
                       <w:rPr>
                         <w:rFonts w:ascii="Cambria Math" w:hAnsi="Cambria Math"/>
                         <w:color w:val="FF0000"/>
+                        <w:sz w:val="24"/>
+                        <w:szCs w:val="28"/>
                       </w:rPr>
                       <m:t>A</m:t>
                     </m:r>
@@ -215,6 +259,8 @@
                       <w:rPr>
                         <w:rFonts w:ascii="Cambria Math" w:hAnsi="Cambria Math"/>
                         <w:color w:val="FF0000"/>
+                        <w:sz w:val="24"/>
+                        <w:szCs w:val="28"/>
                       </w:rPr>
                       <m:t>3</m:t>
                     </m:r>
@@ -226,6 +272,8 @@
                       <w:rPr>
                         <w:rFonts w:ascii="Cambria Math" w:hAnsi="Cambria Math"/>
                         <w:i/>
+                        <w:sz w:val="24"/>
+                        <w:szCs w:val="28"/>
                       </w:rPr>
                     </m:ctrlPr>
                   </m:sSupPr>
@@ -233,6 +281,8 @@
                     <m:r>
                       <w:rPr>
                         <w:rFonts w:ascii="Cambria Math" w:hAnsi="Cambria Math"/>
+                        <w:sz w:val="24"/>
+                        <w:szCs w:val="28"/>
                       </w:rPr>
                       <m:t>T</m:t>
                     </m:r>
@@ -241,6 +291,8 @@
                     <m:r>
                       <w:rPr>
                         <w:rFonts w:ascii="Cambria Math" w:hAnsi="Cambria Math"/>
+                        <w:sz w:val="24"/>
+                        <w:szCs w:val="28"/>
                       </w:rPr>
                       <m:t>3</m:t>
                     </m:r>
@@ -260,18 +312,24 @@
           <w:p>
             <w:pPr>
               <w:rPr>
-                <w:rFonts w:ascii="宋体" w:eastAsia="宋体" w:hAnsi="宋体"/>
+                <w:rFonts w:ascii="楷体" w:eastAsia="楷体" w:hAnsi="楷体"/>
+                <w:sz w:val="24"/>
+                <w:szCs w:val="28"/>
               </w:rPr>
             </w:pPr>
             <w:r>
               <w:rPr>
-                <w:rFonts w:ascii="Times New Roman" w:eastAsia="宋体" w:hAnsi="Times New Roman" w:cs="Times New Roman"/>
+                <w:rFonts w:ascii="Times New Roman" w:eastAsia="楷体" w:hAnsi="Times New Roman" w:cs="Times New Roman" w:hint="cs"/>
+                <w:sz w:val="24"/>
+                <w:szCs w:val="28"/>
               </w:rPr>
               <w:t>K</w:t>
             </w:r>
             <w:r>
               <w:rPr>
-                <w:rFonts w:ascii="宋体" w:eastAsia="宋体" w:hAnsi="宋体" w:hint="eastAsia"/>
+                <w:rFonts w:ascii="楷体" w:eastAsia="楷体" w:hAnsi="楷体" w:hint="eastAsia"/>
+                <w:sz w:val="24"/>
+                <w:szCs w:val="28"/>
               </w:rPr>
               <w:t>型热电偶</w:t>
             </w:r>
@@ -284,6 +342,10 @@
           <w:p>
             <w:pPr>
               <w:jc w:val="left"/>
+              <w:rPr>
+                <w:sz w:val="24"/>
+                <w:szCs w:val="28"/>
+              </w:rPr>
             </w:pPr>
             <m:oMathPara>
               <m:oMathParaPr>
@@ -293,12 +355,16 @@
                 <m:r>
                   <w:rPr>
                     <w:rFonts w:ascii="Cambria Math" w:hAnsi="Cambria Math" w:hint="eastAsia"/>
+                    <w:sz w:val="24"/>
+                    <w:szCs w:val="28"/>
                   </w:rPr>
                   <m:t>T</m:t>
                 </m:r>
                 <m:r>
                   <w:rPr>
                     <w:rFonts w:ascii="Cambria Math" w:hAnsi="Cambria Math"/>
+                    <w:sz w:val="24"/>
+                    <w:szCs w:val="28"/>
                   </w:rPr>
                   <m:t>=</m:t>
                 </m:r>
@@ -309,6 +375,8 @@
                         <w:rFonts w:ascii="Cambria Math" w:hAnsi="Cambria Math"/>
                         <w:i/>
                         <w:color w:val="FF0000"/>
+                        <w:sz w:val="24"/>
+                        <w:szCs w:val="28"/>
                       </w:rPr>
                     </m:ctrlPr>
                   </m:sSubPr>
@@ -317,6 +385,8 @@
                       <w:rPr>
                         <w:rFonts w:ascii="Cambria Math" w:hAnsi="Cambria Math"/>
                         <w:color w:val="FF0000"/>
+                        <w:sz w:val="24"/>
+                        <w:szCs w:val="28"/>
                       </w:rPr>
                       <m:t>A</m:t>
                     </m:r>
@@ -326,6 +396,8 @@
                       <w:rPr>
                         <w:rFonts w:ascii="Cambria Math" w:hAnsi="Cambria Math"/>
                         <w:color w:val="FF0000"/>
+                        <w:sz w:val="24"/>
+                        <w:szCs w:val="28"/>
                       </w:rPr>
                       <m:t>0</m:t>
                     </m:r>
@@ -334,6 +406,8 @@
                 <m:r>
                   <w:rPr>
                     <w:rFonts w:ascii="Cambria Math" w:hAnsi="Cambria Math"/>
+                    <w:sz w:val="24"/>
+                    <w:szCs w:val="28"/>
                   </w:rPr>
                   <m:t>+</m:t>
                 </m:r>
@@ -344,6 +418,8 @@
                         <w:rFonts w:ascii="Cambria Math" w:hAnsi="Cambria Math"/>
                         <w:i/>
                         <w:color w:val="FF0000"/>
+                        <w:sz w:val="24"/>
+                        <w:szCs w:val="28"/>
                       </w:rPr>
                     </m:ctrlPr>
                   </m:sSubPr>
@@ -352,6 +428,8 @@
                       <w:rPr>
                         <w:rFonts w:ascii="Cambria Math" w:hAnsi="Cambria Math"/>
                         <w:color w:val="FF0000"/>
+                        <w:sz w:val="24"/>
+                        <w:szCs w:val="28"/>
                       </w:rPr>
                       <m:t>A</m:t>
                     </m:r>
@@ -361,6 +439,8 @@
                       <w:rPr>
                         <w:rFonts w:ascii="Cambria Math" w:hAnsi="Cambria Math"/>
                         <w:color w:val="FF0000"/>
+                        <w:sz w:val="24"/>
+                        <w:szCs w:val="28"/>
                       </w:rPr>
                       <m:t>1</m:t>
                     </m:r>
@@ -369,6 +449,8 @@
                 <m:r>
                   <w:rPr>
                     <w:rFonts w:ascii="Cambria Math" w:hAnsi="Cambria Math"/>
+                    <w:sz w:val="24"/>
+                    <w:szCs w:val="28"/>
                   </w:rPr>
                   <m:t>E</m:t>
                 </m:r>
@@ -386,12 +468,16 @@
           <w:p>
             <w:pPr>
               <w:rPr>
-                <w:rFonts w:ascii="宋体" w:eastAsia="宋体" w:hAnsi="宋体" w:hint="eastAsia"/>
+                <w:rFonts w:ascii="楷体" w:eastAsia="楷体" w:hAnsi="楷体"/>
+                <w:sz w:val="24"/>
+                <w:szCs w:val="28"/>
               </w:rPr>
             </w:pPr>
             <w:r>
               <w:rPr>
-                <w:rFonts w:ascii="宋体" w:eastAsia="宋体" w:hAnsi="宋体" w:hint="eastAsia"/>
+                <w:rFonts w:ascii="楷体" w:eastAsia="楷体" w:hAnsi="楷体" w:hint="eastAsia"/>
+                <w:sz w:val="24"/>
+                <w:szCs w:val="28"/>
               </w:rPr>
               <w:t>四线热敏电阻</w:t>
             </w:r>
@@ -404,6 +490,10 @@
           <w:p>
             <w:pPr>
               <w:jc w:val="left"/>
+              <w:rPr>
+                <w:sz w:val="24"/>
+                <w:szCs w:val="28"/>
+              </w:rPr>
             </w:pPr>
             <m:oMathPara>
               <m:oMathParaPr>
@@ -413,6 +503,8 @@
                 <m:r>
                   <w:rPr>
                     <w:rFonts w:ascii="Cambria Math" w:hAnsi="Cambria Math"/>
+                    <w:sz w:val="24"/>
+                    <w:szCs w:val="28"/>
                   </w:rPr>
                   <m:t>T=-273.15+</m:t>
                 </m:r>
@@ -422,6 +514,8 @@
                       <w:rPr>
                         <w:rFonts w:ascii="Cambria Math" w:hAnsi="Cambria Math"/>
                         <w:i/>
+                        <w:sz w:val="24"/>
+                        <w:szCs w:val="28"/>
                       </w:rPr>
                     </m:ctrlPr>
                   </m:fPr>
@@ -429,6 +523,8 @@
                     <m:r>
                       <w:rPr>
                         <w:rFonts w:ascii="Cambria Math" w:hAnsi="Cambria Math"/>
+                        <w:sz w:val="24"/>
+                        <w:szCs w:val="28"/>
                       </w:rPr>
                       <m:t>1</m:t>
                     </m:r>
@@ -441,6 +537,8 @@
                             <w:rFonts w:ascii="Cambria Math" w:hAnsi="Cambria Math"/>
                             <w:i/>
                             <w:color w:val="FF0000"/>
+                            <w:sz w:val="24"/>
+                            <w:szCs w:val="28"/>
                           </w:rPr>
                         </m:ctrlPr>
                       </m:sSubPr>
@@ -449,6 +547,8 @@
                           <w:rPr>
                             <w:rFonts w:ascii="Cambria Math" w:hAnsi="Cambria Math"/>
                             <w:color w:val="FF0000"/>
+                            <w:sz w:val="24"/>
+                            <w:szCs w:val="28"/>
                           </w:rPr>
                           <m:t>A</m:t>
                         </m:r>
@@ -458,6 +558,8 @@
                           <w:rPr>
                             <w:rFonts w:ascii="Cambria Math" w:hAnsi="Cambria Math"/>
                             <w:color w:val="FF0000"/>
+                            <w:sz w:val="24"/>
+                            <w:szCs w:val="28"/>
                           </w:rPr>
                           <m:t>0</m:t>
                         </m:r>
@@ -466,6 +568,8 @@
                     <m:r>
                       <w:rPr>
                         <w:rFonts w:ascii="Cambria Math" w:hAnsi="Cambria Math"/>
+                        <w:sz w:val="24"/>
+                        <w:szCs w:val="28"/>
                       </w:rPr>
                       <m:t>+</m:t>
                     </m:r>
@@ -476,6 +580,8 @@
                             <w:rFonts w:ascii="Cambria Math" w:hAnsi="Cambria Math"/>
                             <w:i/>
                             <w:color w:val="FF0000"/>
+                            <w:sz w:val="24"/>
+                            <w:szCs w:val="28"/>
                           </w:rPr>
                         </m:ctrlPr>
                       </m:sSubPr>
@@ -484,6 +590,8 @@
                           <w:rPr>
                             <w:rFonts w:ascii="Cambria Math" w:hAnsi="Cambria Math"/>
                             <w:color w:val="FF0000"/>
+                            <w:sz w:val="24"/>
+                            <w:szCs w:val="28"/>
                           </w:rPr>
                           <m:t>A</m:t>
                         </m:r>
@@ -493,6 +601,8 @@
                           <w:rPr>
                             <w:rFonts w:ascii="Cambria Math" w:hAnsi="Cambria Math"/>
                             <w:color w:val="FF0000"/>
+                            <w:sz w:val="24"/>
+                            <w:szCs w:val="28"/>
                           </w:rPr>
                           <m:t>1</m:t>
                         </m:r>
@@ -504,6 +614,8 @@
                           <w:rPr>
                             <w:rFonts w:ascii="Cambria Math" w:hAnsi="Cambria Math"/>
                             <w:i/>
+                            <w:sz w:val="24"/>
+                            <w:szCs w:val="28"/>
                           </w:rPr>
                         </m:ctrlPr>
                       </m:funcPr>
@@ -511,6 +623,8 @@
                         <m:r>
                           <w:rPr>
                             <w:rFonts w:ascii="Cambria Math" w:hAnsi="Cambria Math"/>
+                            <w:sz w:val="24"/>
+                            <w:szCs w:val="28"/>
                           </w:rPr>
                           <m:t>ln</m:t>
                         </m:r>
@@ -522,6 +636,8 @@
                               <w:rPr>
                                 <w:rFonts w:ascii="Cambria Math" w:hAnsi="Cambria Math"/>
                                 <w:i/>
+                                <w:sz w:val="24"/>
+                                <w:szCs w:val="28"/>
                               </w:rPr>
                             </m:ctrlPr>
                           </m:sSubPr>
@@ -529,6 +645,8 @@
                             <m:r>
                               <w:rPr>
                                 <w:rFonts w:ascii="Cambria Math" w:hAnsi="Cambria Math"/>
+                                <w:sz w:val="24"/>
+                                <w:szCs w:val="28"/>
                               </w:rPr>
                               <m:t>R</m:t>
                             </m:r>
@@ -537,6 +655,8 @@
                             <m:r>
                               <w:rPr>
                                 <w:rFonts w:ascii="Cambria Math" w:hAnsi="Cambria Math"/>
+                                <w:sz w:val="24"/>
+                                <w:szCs w:val="28"/>
                               </w:rPr>
                               <m:t>T</m:t>
                             </m:r>
@@ -547,6 +667,8 @@
                     <m:r>
                       <w:rPr>
                         <w:rFonts w:ascii="Cambria Math" w:hAnsi="Cambria Math"/>
+                        <w:sz w:val="24"/>
+                        <w:szCs w:val="28"/>
                       </w:rPr>
                       <m:t>+</m:t>
                     </m:r>
@@ -557,6 +679,8 @@
                             <w:rFonts w:ascii="Cambria Math" w:hAnsi="Cambria Math"/>
                             <w:i/>
                             <w:color w:val="FF0000"/>
+                            <w:sz w:val="24"/>
+                            <w:szCs w:val="28"/>
                           </w:rPr>
                         </m:ctrlPr>
                       </m:sSubPr>
@@ -565,6 +689,8 @@
                           <w:rPr>
                             <w:rFonts w:ascii="Cambria Math" w:hAnsi="Cambria Math"/>
                             <w:color w:val="FF0000"/>
+                            <w:sz w:val="24"/>
+                            <w:szCs w:val="28"/>
                           </w:rPr>
                           <m:t>A</m:t>
                         </m:r>
@@ -574,6 +700,8 @@
                           <w:rPr>
                             <w:rFonts w:ascii="Cambria Math" w:hAnsi="Cambria Math"/>
                             <w:color w:val="FF0000"/>
+                            <w:sz w:val="24"/>
+                            <w:szCs w:val="28"/>
                           </w:rPr>
                           <m:t>2</m:t>
                         </m:r>
@@ -585,6 +713,8 @@
                           <w:rPr>
                             <w:rFonts w:ascii="Cambria Math" w:hAnsi="Cambria Math"/>
                             <w:i/>
+                            <w:sz w:val="24"/>
+                            <w:szCs w:val="28"/>
                           </w:rPr>
                         </m:ctrlPr>
                       </m:sSupPr>
@@ -595,6 +725,8 @@
                               <w:rPr>
                                 <w:rFonts w:ascii="Cambria Math" w:hAnsi="Cambria Math"/>
                                 <w:i/>
+                                <w:sz w:val="24"/>
+                                <w:szCs w:val="28"/>
                               </w:rPr>
                             </m:ctrlPr>
                           </m:dPr>
@@ -605,6 +737,8 @@
                                   <w:rPr>
                                     <w:rFonts w:ascii="Cambria Math" w:hAnsi="Cambria Math"/>
                                     <w:i/>
+                                    <w:sz w:val="24"/>
+                                    <w:szCs w:val="28"/>
                                   </w:rPr>
                                 </m:ctrlPr>
                               </m:funcPr>
@@ -612,6 +746,8 @@
                                 <m:r>
                                   <w:rPr>
                                     <w:rFonts w:ascii="Cambria Math" w:hAnsi="Cambria Math"/>
+                                    <w:sz w:val="24"/>
+                                    <w:szCs w:val="28"/>
                                   </w:rPr>
                                   <m:t>ln</m:t>
                                 </m:r>
@@ -623,6 +759,8 @@
                                       <w:rPr>
                                         <w:rFonts w:ascii="Cambria Math" w:hAnsi="Cambria Math"/>
                                         <w:i/>
+                                        <w:sz w:val="24"/>
+                                        <w:szCs w:val="28"/>
                                       </w:rPr>
                                     </m:ctrlPr>
                                   </m:sSubPr>
@@ -630,6 +768,8 @@
                                     <m:r>
                                       <w:rPr>
                                         <w:rFonts w:ascii="Cambria Math" w:hAnsi="Cambria Math"/>
+                                        <w:sz w:val="24"/>
+                                        <w:szCs w:val="28"/>
                                       </w:rPr>
                                       <m:t>R</m:t>
                                     </m:r>
@@ -638,6 +778,8 @@
                                     <m:r>
                                       <w:rPr>
                                         <w:rFonts w:ascii="Cambria Math" w:hAnsi="Cambria Math"/>
+                                        <w:sz w:val="24"/>
+                                        <w:szCs w:val="28"/>
                                       </w:rPr>
                                       <m:t>T</m:t>
                                     </m:r>
@@ -652,6 +794,8 @@
                         <m:r>
                           <w:rPr>
                             <w:rFonts w:ascii="Cambria Math" w:hAnsi="Cambria Math"/>
+                            <w:sz w:val="24"/>
+                            <w:szCs w:val="28"/>
                           </w:rPr>
                           <m:t>3</m:t>
                         </m:r>
@@ -673,20 +817,26 @@
           <w:p>
             <w:pPr>
               <w:rPr>
-                <w:rFonts w:ascii="宋体" w:eastAsia="宋体" w:hAnsi="宋体"/>
+                <w:rFonts w:ascii="楷体" w:eastAsia="楷体" w:hAnsi="楷体"/>
+                <w:sz w:val="24"/>
+                <w:szCs w:val="28"/>
               </w:rPr>
             </w:pPr>
             <w:proofErr w:type="gramStart"/>
             <w:r>
               <w:rPr>
-                <w:rFonts w:ascii="宋体" w:eastAsia="宋体" w:hAnsi="宋体" w:hint="eastAsia"/>
+                <w:rFonts w:ascii="楷体" w:eastAsia="楷体" w:hAnsi="楷体" w:hint="eastAsia"/>
+                <w:sz w:val="24"/>
+                <w:szCs w:val="28"/>
               </w:rPr>
               <w:t>铂</w:t>
             </w:r>
             <w:proofErr w:type="gramEnd"/>
             <w:r>
               <w:rPr>
-                <w:rFonts w:ascii="宋体" w:eastAsia="宋体" w:hAnsi="宋体" w:hint="eastAsia"/>
+                <w:rFonts w:ascii="楷体" w:eastAsia="楷体" w:hAnsi="楷体" w:hint="eastAsia"/>
+                <w:sz w:val="24"/>
+                <w:szCs w:val="28"/>
               </w:rPr>
               <w:t>电阻</w:t>
             </w:r>
@@ -699,6 +849,10 @@
           <w:p>
             <w:pPr>
               <w:jc w:val="left"/>
+              <w:rPr>
+                <w:sz w:val="24"/>
+                <w:szCs w:val="28"/>
+              </w:rPr>
             </w:pPr>
             <m:oMathPara>
               <m:oMathParaPr>
@@ -708,47 +862,110 @@
                 <m:r>
                   <w:rPr>
                     <w:rFonts w:ascii="Cambria Math" w:hAnsi="Cambria Math" w:hint="eastAsia"/>
+                    <w:sz w:val="24"/>
+                    <w:szCs w:val="28"/>
+                  </w:rPr>
+                  <m:t>T</m:t>
+                </m:r>
+                <m:r>
+                  <w:rPr>
+                    <w:rFonts w:ascii="Cambria Math" w:hAnsi="Cambria Math"/>
+                    <w:sz w:val="24"/>
+                    <w:szCs w:val="28"/>
+                  </w:rPr>
+                  <m:t>=</m:t>
+                </m:r>
+                <m:sSub>
+                  <m:sSubPr>
+                    <m:ctrlPr>
+                      <w:rPr>
+                        <w:rFonts w:ascii="Cambria Math" w:hAnsi="Cambria Math"/>
+                        <w:i/>
+                        <w:color w:val="FF0000"/>
+                        <w:sz w:val="24"/>
+                        <w:szCs w:val="28"/>
+                      </w:rPr>
+                    </m:ctrlPr>
+                  </m:sSubPr>
+                  <m:e>
+                    <m:r>
+                      <w:rPr>
+                        <w:rFonts w:ascii="Cambria Math" w:hAnsi="Cambria Math"/>
+                        <w:color w:val="FF0000"/>
+                        <w:sz w:val="24"/>
+                        <w:szCs w:val="28"/>
+                      </w:rPr>
+                      <m:t>A</m:t>
+                    </m:r>
+                  </m:e>
+                  <m:sub>
+                    <m:r>
+                      <w:rPr>
+                        <w:rFonts w:ascii="Cambria Math" w:hAnsi="Cambria Math"/>
+                        <w:color w:val="FF0000"/>
+                        <w:sz w:val="24"/>
+                        <w:szCs w:val="28"/>
+                      </w:rPr>
+                      <m:t>0</m:t>
+                    </m:r>
+                  </m:sub>
+                </m:sSub>
+                <m:r>
+                  <w:rPr>
+                    <w:rFonts w:ascii="Cambria Math" w:hAnsi="Cambria Math"/>
+                    <w:sz w:val="24"/>
+                    <w:szCs w:val="28"/>
+                  </w:rPr>
+                  <m:t>+</m:t>
+                </m:r>
+                <m:sSub>
+                  <m:sSubPr>
+                    <m:ctrlPr>
+                      <w:rPr>
+                        <w:rFonts w:ascii="Cambria Math" w:hAnsi="Cambria Math"/>
+                        <w:i/>
+                        <w:color w:val="FF0000"/>
+                        <w:sz w:val="24"/>
+                        <w:szCs w:val="28"/>
+                      </w:rPr>
+                    </m:ctrlPr>
+                  </m:sSubPr>
+                  <m:e>
+                    <m:r>
+                      <w:rPr>
+                        <w:rFonts w:ascii="Cambria Math" w:hAnsi="Cambria Math"/>
+                        <w:color w:val="FF0000"/>
+                        <w:sz w:val="24"/>
+                        <w:szCs w:val="28"/>
+                      </w:rPr>
+                      <m:t>A</m:t>
+                    </m:r>
+                  </m:e>
+                  <m:sub>
+                    <m:r>
+                      <w:rPr>
+                        <w:rFonts w:ascii="Cambria Math" w:hAnsi="Cambria Math"/>
+                        <w:color w:val="FF0000"/>
+                        <w:sz w:val="24"/>
+                        <w:szCs w:val="28"/>
+                      </w:rPr>
+                      <m:t>1</m:t>
+                    </m:r>
+                  </m:sub>
+                </m:sSub>
+                <m:r>
+                  <w:rPr>
+                    <w:rFonts w:ascii="Cambria Math" w:hAnsi="Cambria Math"/>
+                    <w:sz w:val="24"/>
+                    <w:szCs w:val="28"/>
                   </w:rPr>
                   <m:t>R</m:t>
                 </m:r>
                 <m:r>
                   <w:rPr>
                     <w:rFonts w:ascii="Cambria Math" w:hAnsi="Cambria Math"/>
-                  </w:rPr>
-                  <m:t>=</m:t>
-                </m:r>
-                <m:sSub>
-                  <m:sSubPr>
-                    <m:ctrlPr>
-                      <w:rPr>
-                        <w:rFonts w:ascii="Cambria Math" w:hAnsi="Cambria Math"/>
-                        <w:i/>
-                        <w:color w:val="FF0000"/>
-                      </w:rPr>
-                    </m:ctrlPr>
-                  </m:sSubPr>
-                  <m:e>
-                    <m:r>
-                      <w:rPr>
-                        <w:rFonts w:ascii="Cambria Math" w:hAnsi="Cambria Math"/>
-                        <w:color w:val="FF0000"/>
-                      </w:rPr>
-                      <m:t>A</m:t>
-                    </m:r>
-                  </m:e>
-                  <m:sub>
-                    <m:r>
-                      <w:rPr>
-                        <w:rFonts w:ascii="Cambria Math" w:hAnsi="Cambria Math"/>
-                        <w:color w:val="FF0000"/>
-                      </w:rPr>
-                      <m:t>0</m:t>
-                    </m:r>
-                  </m:sub>
-                </m:sSub>
-                <m:r>
-                  <w:rPr>
-                    <w:rFonts w:ascii="Cambria Math" w:hAnsi="Cambria Math"/>
+                    <w:sz w:val="24"/>
+                    <w:szCs w:val="28"/>
                   </w:rPr>
                   <m:t>+</m:t>
                 </m:r>
@@ -759,6 +976,8 @@
                         <w:rFonts w:ascii="Cambria Math" w:hAnsi="Cambria Math"/>
                         <w:i/>
                         <w:color w:val="FF0000"/>
+                        <w:sz w:val="24"/>
+                        <w:szCs w:val="28"/>
                       </w:rPr>
                     </m:ctrlPr>
                   </m:sSubPr>
@@ -767,6 +986,8 @@
                       <w:rPr>
                         <w:rFonts w:ascii="Cambria Math" w:hAnsi="Cambria Math"/>
                         <w:color w:val="FF0000"/>
+                        <w:sz w:val="24"/>
+                        <w:szCs w:val="28"/>
                       </w:rPr>
                       <m:t>A</m:t>
                     </m:r>
@@ -776,41 +997,8 @@
                       <w:rPr>
                         <w:rFonts w:ascii="Cambria Math" w:hAnsi="Cambria Math"/>
                         <w:color w:val="FF0000"/>
-                      </w:rPr>
-                      <m:t>1</m:t>
-                    </m:r>
-                  </m:sub>
-                </m:sSub>
-                <m:r>
-                  <w:rPr>
-                    <w:rFonts w:ascii="Cambria Math" w:hAnsi="Cambria Math"/>
-                  </w:rPr>
-                  <m:t>T+</m:t>
-                </m:r>
-                <m:sSub>
-                  <m:sSubPr>
-                    <m:ctrlPr>
-                      <w:rPr>
-                        <w:rFonts w:ascii="Cambria Math" w:hAnsi="Cambria Math"/>
-                        <w:i/>
-                        <w:color w:val="FF0000"/>
-                      </w:rPr>
-                    </m:ctrlPr>
-                  </m:sSubPr>
-                  <m:e>
-                    <m:r>
-                      <w:rPr>
-                        <w:rFonts w:ascii="Cambria Math" w:hAnsi="Cambria Math"/>
-                        <w:color w:val="FF0000"/>
-                      </w:rPr>
-                      <m:t>A</m:t>
-                    </m:r>
-                  </m:e>
-                  <m:sub>
-                    <m:r>
-                      <w:rPr>
-                        <w:rFonts w:ascii="Cambria Math" w:hAnsi="Cambria Math"/>
-                        <w:color w:val="FF0000"/>
+                        <w:sz w:val="24"/>
+                        <w:szCs w:val="28"/>
                       </w:rPr>
                       <m:t>2</m:t>
                     </m:r>
@@ -822,6 +1010,8 @@
                       <w:rPr>
                         <w:rFonts w:ascii="Cambria Math" w:hAnsi="Cambria Math"/>
                         <w:i/>
+                        <w:sz w:val="24"/>
+                        <w:szCs w:val="28"/>
                       </w:rPr>
                     </m:ctrlPr>
                   </m:sSupPr>
@@ -829,14 +1019,18 @@
                     <m:r>
                       <w:rPr>
                         <w:rFonts w:ascii="Cambria Math" w:hAnsi="Cambria Math"/>
-                      </w:rPr>
-                      <m:t>T</m:t>
+                        <w:sz w:val="24"/>
+                        <w:szCs w:val="28"/>
+                      </w:rPr>
+                      <m:t>R</m:t>
                     </m:r>
                   </m:e>
                   <m:sup>
                     <m:r>
                       <w:rPr>
                         <w:rFonts w:ascii="Cambria Math" w:hAnsi="Cambria Math"/>
+                        <w:sz w:val="24"/>
+                        <w:szCs w:val="28"/>
                       </w:rPr>
                       <m:t>2</m:t>
                     </m:r>
@@ -845,6 +1039,8 @@
                 <m:r>
                   <w:rPr>
                     <w:rFonts w:ascii="Cambria Math" w:hAnsi="Cambria Math"/>
+                    <w:sz w:val="24"/>
+                    <w:szCs w:val="28"/>
                   </w:rPr>
                   <m:t>+</m:t>
                 </m:r>
@@ -855,6 +1051,8 @@
                         <w:rFonts w:ascii="Cambria Math" w:hAnsi="Cambria Math"/>
                         <w:i/>
                         <w:color w:val="FF0000"/>
+                        <w:sz w:val="24"/>
+                        <w:szCs w:val="28"/>
                       </w:rPr>
                     </m:ctrlPr>
                   </m:sSubPr>
@@ -863,6 +1061,8 @@
                       <w:rPr>
                         <w:rFonts w:ascii="Cambria Math" w:hAnsi="Cambria Math"/>
                         <w:color w:val="FF0000"/>
+                        <w:sz w:val="24"/>
+                        <w:szCs w:val="28"/>
                       </w:rPr>
                       <m:t>A</m:t>
                     </m:r>
@@ -872,6 +1072,8 @@
                       <w:rPr>
                         <w:rFonts w:ascii="Cambria Math" w:hAnsi="Cambria Math"/>
                         <w:color w:val="FF0000"/>
+                        <w:sz w:val="24"/>
+                        <w:szCs w:val="28"/>
                       </w:rPr>
                       <m:t>3</m:t>
                     </m:r>
@@ -883,6 +1085,8 @@
                       <w:rPr>
                         <w:rFonts w:ascii="Cambria Math" w:hAnsi="Cambria Math"/>
                         <w:i/>
+                        <w:sz w:val="24"/>
+                        <w:szCs w:val="28"/>
                       </w:rPr>
                     </m:ctrlPr>
                   </m:sSupPr>
@@ -890,14 +1094,18 @@
                     <m:r>
                       <w:rPr>
                         <w:rFonts w:ascii="Cambria Math" w:hAnsi="Cambria Math"/>
-                      </w:rPr>
-                      <m:t>T</m:t>
+                        <w:sz w:val="24"/>
+                        <w:szCs w:val="28"/>
+                      </w:rPr>
+                      <m:t xml:space="preserve"> R</m:t>
                     </m:r>
                   </m:e>
                   <m:sup>
                     <m:r>
                       <w:rPr>
                         <w:rFonts w:ascii="Cambria Math" w:hAnsi="Cambria Math"/>
+                        <w:sz w:val="24"/>
+                        <w:szCs w:val="28"/>
                       </w:rPr>
                       <m:t>3</m:t>
                     </m:r>
@@ -915,17 +1123,13 @@
     <w:p/>
     <w:p/>
     <w:p>
-      <w:pPr>
-        <w:rPr>
-          <w:rFonts w:hint="eastAsia"/>
-        </w:rPr>
-      </w:pPr>
       <w:r>
         <w:rPr>
           <w:rFonts w:hint="eastAsia"/>
+          <w:noProof/>
         </w:rPr>
         <w:drawing>
-          <wp:inline distT="0" distB="0" distL="0" distR="0">
+          <wp:inline distT="0" distB="0" distL="0" distR="0" wp14:anchorId="660B0ED9" wp14:editId="5145921E">
             <wp:extent cx="5274310" cy="1484630"/>
             <wp:effectExtent l="0" t="0" r="0" b="0"/>
             <wp:docPr id="1726658208" name="图片 1"/>
@@ -942,7 +1146,7 @@
                     </pic:cNvPicPr>
                   </pic:nvPicPr>
                   <pic:blipFill>
-                    <a:blip r:embed="rId4" cstate="print">
+                    <a:blip r:embed="rId6" cstate="print">
                       <a:extLst>
                         <a:ext uri="{28A0092B-C50C-407E-A947-70E740481C1C}">
                           <a14:useLocalDpi xmlns:a14="http://schemas.microsoft.com/office/drawing/2010/main" val="0"/>
@@ -982,6 +1186,44 @@
     </w:sectPr>
   </w:body>
 </w:document>
+</file>
+
+<file path=word/endnotes.xml><?xml version="1.0" encoding="utf-8"?>
+<w:endnotes xmlns:wpc="http://schemas.microsoft.com/office/word/2010/wordprocessingCanvas" xmlns:cx="http://schemas.microsoft.com/office/drawing/2014/chartex" xmlns:cx1="http://schemas.microsoft.com/office/drawing/2015/9/8/chartex" xmlns:cx2="http://schemas.microsoft.com/office/drawing/2015/10/21/chartex" xmlns:cx3="http://schemas.microsoft.com/office/drawing/2016/5/9/chartex" xmlns:cx4="http://schemas.microsoft.com/office/drawing/2016/5/10/chartex" xmlns:cx5="http://schemas.microsoft.com/office/drawing/2016/5/11/chartex" xmlns:cx6="http://schemas.microsoft.com/office/drawing/2016/5/12/chartex" xmlns:cx7="http://schemas.microsoft.com/office/drawing/2016/5/13/chartex" xmlns:cx8="http://schemas.microsoft.com/office/drawing/2016/5/14/chartex" xmlns:mc="http://schemas.openxmlformats.org/markup-compatibility/2006" xmlns:aink="http://schemas.microsoft.com/office/drawing/2016/ink" xmlns:am3d="http://schemas.microsoft.com/office/drawing/2017/model3d" xmlns:o="urn:schemas-microsoft-com:office:office" xmlns:r="http://schemas.openxmlformats.org/officeDocument/2006/relationships" xmlns:m="http://schemas.openxmlformats.org/officeDocument/2006/math" xmlns:v="urn:schemas-microsoft-com:vml" xmlns:wp14="http://schemas.microsoft.com/office/word/2010/wordprocessingDrawing" xmlns:wp="http://schemas.openxmlformats.org/drawingml/2006/wordprocessingDrawing" xmlns:w10="urn:schemas-microsoft-com:office:word" xmlns:w="http://schemas.openxmlformats.org/wordprocessingml/2006/main" xmlns:w14="http://schemas.microsoft.com/office/word/2010/wordml" xmlns:w15="http://schemas.microsoft.com/office/word/2012/wordml" xmlns:w16cex="http://schemas.microsoft.com/office/word/2018/wordml/cex" xmlns:w16cid="http://schemas.microsoft.com/office/word/2016/wordml/cid" xmlns:w16="http://schemas.microsoft.com/office/word/2018/wordml" xmlns:w16sdtdh="http://schemas.microsoft.com/office/word/2020/wordml/sdtdatahash" xmlns:w16se="http://schemas.microsoft.com/office/word/2015/wordml/symex" xmlns:wpg="http://schemas.microsoft.com/office/word/2010/wordprocessingGroup" xmlns:wpi="http://schemas.microsoft.com/office/word/2010/wordprocessingInk" xmlns:wne="http://schemas.microsoft.com/office/word/2006/wordml" xmlns:wps="http://schemas.microsoft.com/office/word/2010/wordprocessingShape" mc:Ignorable="w14 w15 w16se w16cid w16 w16cex w16sdtdh wp14">
+  <w:endnote w:type="separator" w:id="-1">
+    <w:p>
+      <w:r>
+        <w:separator/>
+      </w:r>
+    </w:p>
+  </w:endnote>
+  <w:endnote w:type="continuationSeparator" w:id="0">
+    <w:p>
+      <w:r>
+        <w:continuationSeparator/>
+      </w:r>
+    </w:p>
+  </w:endnote>
+</w:endnotes>
+</file>
+
+<file path=word/footnotes.xml><?xml version="1.0" encoding="utf-8"?>
+<w:footnotes xmlns:wpc="http://schemas.microsoft.com/office/word/2010/wordprocessingCanvas" xmlns:cx="http://schemas.microsoft.com/office/drawing/2014/chartex" xmlns:cx1="http://schemas.microsoft.com/office/drawing/2015/9/8/chartex" xmlns:cx2="http://schemas.microsoft.com/office/drawing/2015/10/21/chartex" xmlns:cx3="http://schemas.microsoft.com/office/drawing/2016/5/9/chartex" xmlns:cx4="http://schemas.microsoft.com/office/drawing/2016/5/10/chartex" xmlns:cx5="http://schemas.microsoft.com/office/drawing/2016/5/11/chartex" xmlns:cx6="http://schemas.microsoft.com/office/drawing/2016/5/12/chartex" xmlns:cx7="http://schemas.microsoft.com/office/drawing/2016/5/13/chartex" xmlns:cx8="http://schemas.microsoft.com/office/drawing/2016/5/14/chartex" xmlns:mc="http://schemas.openxmlformats.org/markup-compatibility/2006" xmlns:aink="http://schemas.microsoft.com/office/drawing/2016/ink" xmlns:am3d="http://schemas.microsoft.com/office/drawing/2017/model3d" xmlns:o="urn:schemas-microsoft-com:office:office" xmlns:r="http://schemas.openxmlformats.org/officeDocument/2006/relationships" xmlns:m="http://schemas.openxmlformats.org/officeDocument/2006/math" xmlns:v="urn:schemas-microsoft-com:vml" xmlns:wp14="http://schemas.microsoft.com/office/word/2010/wordprocessingDrawing" xmlns:wp="http://schemas.openxmlformats.org/drawingml/2006/wordprocessingDrawing" xmlns:w10="urn:schemas-microsoft-com:office:word" xmlns:w="http://schemas.openxmlformats.org/wordprocessingml/2006/main" xmlns:w14="http://schemas.microsoft.com/office/word/2010/wordml" xmlns:w15="http://schemas.microsoft.com/office/word/2012/wordml" xmlns:w16cex="http://schemas.microsoft.com/office/word/2018/wordml/cex" xmlns:w16cid="http://schemas.microsoft.com/office/word/2016/wordml/cid" xmlns:w16="http://schemas.microsoft.com/office/word/2018/wordml" xmlns:w16sdtdh="http://schemas.microsoft.com/office/word/2020/wordml/sdtdatahash" xmlns:w16se="http://schemas.microsoft.com/office/word/2015/wordml/symex" xmlns:wpg="http://schemas.microsoft.com/office/word/2010/wordprocessingGroup" xmlns:wpi="http://schemas.microsoft.com/office/word/2010/wordprocessingInk" xmlns:wne="http://schemas.microsoft.com/office/word/2006/wordml" xmlns:wps="http://schemas.microsoft.com/office/word/2010/wordprocessingShape" mc:Ignorable="w14 w15 w16se w16cid w16 w16cex w16sdtdh wp14">
+  <w:footnote w:type="separator" w:id="-1">
+    <w:p>
+      <w:r>
+        <w:separator/>
+      </w:r>
+    </w:p>
+  </w:footnote>
+  <w:footnote w:type="continuationSeparator" w:id="0">
+    <w:p>
+      <w:r>
+        <w:continuationSeparator/>
+      </w:r>
+    </w:p>
+  </w:footnote>
+</w:footnotes>
 </file>
 
 <file path=word/styles.xml><?xml version="1.0" encoding="utf-8"?>
@@ -1457,6 +1699,71 @@
       <w:color w:val="666666"/>
     </w:rPr>
   </w:style>
+  <w:style w:type="paragraph" w:styleId="a6">
+    <w:name w:val="header"/>
+    <w:basedOn w:val="a"/>
+    <w:link w:val="a7"/>
+    <w:uiPriority w:val="99"/>
+    <w:unhideWhenUsed/>
+    <w:rsid w:val="00444B60"/>
+    <w:pPr>
+      <w:pBdr>
+        <w:bottom w:val="single" w:sz="6" w:space="1" w:color="auto"/>
+      </w:pBdr>
+      <w:tabs>
+        <w:tab w:val="center" w:pos="4153"/>
+        <w:tab w:val="right" w:pos="8306"/>
+      </w:tabs>
+      <w:snapToGrid w:val="0"/>
+      <w:jc w:val="center"/>
+    </w:pPr>
+    <w:rPr>
+      <w:sz w:val="18"/>
+      <w:szCs w:val="18"/>
+    </w:rPr>
+  </w:style>
+  <w:style w:type="character" w:customStyle="1" w:styleId="a7">
+    <w:name w:val="页眉 字符"/>
+    <w:basedOn w:val="a0"/>
+    <w:link w:val="a6"/>
+    <w:uiPriority w:val="99"/>
+    <w:rsid w:val="00444B60"/>
+    <w:rPr>
+      <w:sz w:val="18"/>
+      <w:szCs w:val="18"/>
+    </w:rPr>
+  </w:style>
+  <w:style w:type="paragraph" w:styleId="a8">
+    <w:name w:val="footer"/>
+    <w:basedOn w:val="a"/>
+    <w:link w:val="a9"/>
+    <w:uiPriority w:val="99"/>
+    <w:unhideWhenUsed/>
+    <w:rsid w:val="00444B60"/>
+    <w:pPr>
+      <w:tabs>
+        <w:tab w:val="center" w:pos="4153"/>
+        <w:tab w:val="right" w:pos="8306"/>
+      </w:tabs>
+      <w:snapToGrid w:val="0"/>
+      <w:jc w:val="left"/>
+    </w:pPr>
+    <w:rPr>
+      <w:sz w:val="18"/>
+      <w:szCs w:val="18"/>
+    </w:rPr>
+  </w:style>
+  <w:style w:type="character" w:customStyle="1" w:styleId="a9">
+    <w:name w:val="页脚 字符"/>
+    <w:basedOn w:val="a0"/>
+    <w:link w:val="a8"/>
+    <w:uiPriority w:val="99"/>
+    <w:rsid w:val="00444B60"/>
+    <w:rPr>
+      <w:sz w:val="18"/>
+      <w:szCs w:val="18"/>
+    </w:rPr>
+  </w:style>
 </w:styles>
 </file>
 

</xml_diff>